<commit_message>
Added pdf file of the technical Report
</commit_message>
<xml_diff>
--- a/SYSTEM_TECHNICAL_REPORT.docx
+++ b/SYSTEM_TECHNICAL_REPORT.docx
@@ -12705,9 +12705,10 @@
       </w:r>
     </w:p>
     <w:sectPr>
-      <w:footerReference w:type="default" r:id="rId15"/>
+      <w:headerReference w:type="default" r:id="rId15"/>
+      <w:footerReference w:type="default" r:id="rId16"/>
       <w:pgSz w:w="12240" w:h="15840"/>
-      <w:pgMar w:top="1080" w:right="1260" w:bottom="1080" w:left="1260" w:header="708" w:footer="708" w:gutter="0"/>
+      <w:pgMar w:top="1080" w:right="1260" w:bottom="1080" w:left="1260" w:header="432" w:footer="708" w:gutter="0"/>
       <w:cols w:space="720"/>
       <w:docGrid w:linePitch="360"/>
     </w:sectPr>
@@ -12747,7 +12748,6 @@
         <w:docPartUnique/>
       </w:docPartObj>
     </w:sdtPr>
-    <w:sdtEndPr/>
     <w:sdtContent>
       <w:sdt>
         <w:sdtPr>
@@ -12760,7 +12760,6 @@
             <w:docPartUnique/>
           </w:docPartObj>
         </w:sdtPr>
-        <w:sdtEndPr/>
         <w:sdtContent>
           <w:p>
             <w:pPr>
@@ -12974,6 +12973,51 @@
     </w:p>
   </w:footnote>
 </w:footnotes>
+</file>
+
+<file path=word/header1.xml><?xml version="1.0" encoding="utf-8"?>
+<w:hdr xmlns:wpc="http://schemas.microsoft.com/office/word/2010/wordprocessingCanvas" xmlns:cx="http://schemas.microsoft.com/office/drawing/2014/chartex" xmlns:cx1="http://schemas.microsoft.com/office/drawing/2015/9/8/chartex" xmlns:cx2="http://schemas.microsoft.com/office/drawing/2015/10/21/chartex" xmlns:cx3="http://schemas.microsoft.com/office/drawing/2016/5/9/chartex" xmlns:cx4="http://schemas.microsoft.com/office/drawing/2016/5/10/chartex" xmlns:cx5="http://schemas.microsoft.com/office/drawing/2016/5/11/chartex" xmlns:cx6="http://schemas.microsoft.com/office/drawing/2016/5/12/chartex" xmlns:cx7="http://schemas.microsoft.com/office/drawing/2016/5/13/chartex" xmlns:cx8="http://schemas.microsoft.com/office/drawing/2016/5/14/chartex" xmlns:mc="http://schemas.openxmlformats.org/markup-compatibility/2006" xmlns:aink="http://schemas.microsoft.com/office/drawing/2016/ink" xmlns:am3d="http://schemas.microsoft.com/office/drawing/2017/model3d" xmlns:o="urn:schemas-microsoft-com:office:office" xmlns:oel="http://schemas.microsoft.com/office/2019/extlst" xmlns:r="http://schemas.openxmlformats.org/officeDocument/2006/relationships" xmlns:m="http://schemas.openxmlformats.org/officeDocument/2006/math" xmlns:v="urn:schemas-microsoft-com:vml" xmlns:wp14="http://schemas.microsoft.com/office/word/2010/wordprocessingDrawing" xmlns:wp="http://schemas.openxmlformats.org/drawingml/2006/wordprocessingDrawing" xmlns:w10="urn:schemas-microsoft-com:office:word" xmlns:w="http://schemas.openxmlformats.org/wordprocessingml/2006/main" xmlns:w14="http://schemas.microsoft.com/office/word/2010/wordml" xmlns:w15="http://schemas.microsoft.com/office/word/2012/wordml" xmlns:w16cex="http://schemas.microsoft.com/office/word/2018/wordml/cex" xmlns:w16cid="http://schemas.microsoft.com/office/word/2016/wordml/cid" xmlns:w16="http://schemas.microsoft.com/office/word/2018/wordml" xmlns:w16du="http://schemas.microsoft.com/office/word/2023/wordml/word16du" xmlns:w16sdtdh="http://schemas.microsoft.com/office/word/2020/wordml/sdtdatahash" xmlns:w16sdtfl="http://schemas.microsoft.com/office/word/2024/wordml/sdtformatlock" xmlns:w16se="http://schemas.microsoft.com/office/word/2015/wordml/symex" xmlns:wpg="http://schemas.microsoft.com/office/word/2010/wordprocessingGroup" xmlns:wpi="http://schemas.microsoft.com/office/word/2010/wordprocessingInk" xmlns:wne="http://schemas.microsoft.com/office/word/2006/wordml" xmlns:wps="http://schemas.microsoft.com/office/word/2010/wordprocessingShape" mc:Ignorable="w14 w15 w16se w16cid w16 w16cex w16sdtdh w16sdtfl w16du wp14">
+  <w:p>
+    <w:pPr>
+      <w:pStyle w:val="Header"/>
+      <w:jc w:val="center"/>
+      <w:rPr>
+        <w:b/>
+        <w:bCs/>
+        <w:sz w:val="28"/>
+        <w:szCs w:val="28"/>
+      </w:rPr>
+    </w:pPr>
+    <w:r>
+      <w:rPr>
+        <w:b/>
+        <w:bCs/>
+        <w:sz w:val="28"/>
+        <w:szCs w:val="28"/>
+      </w:rPr>
+      <w:t>NAME: PRINCE PIO ANAAYIRE</w:t>
+    </w:r>
+    <w:r>
+      <w:rPr>
+        <w:b/>
+        <w:bCs/>
+        <w:sz w:val="28"/>
+        <w:szCs w:val="28"/>
+      </w:rPr>
+      <w:t xml:space="preserve">                     </w:t>
+    </w:r>
+    <w:r>
+      <w:rPr>
+        <w:b/>
+        <w:bCs/>
+        <w:sz w:val="28"/>
+        <w:szCs w:val="28"/>
+      </w:rPr>
+      <w:tab/>
+      <w:t>INDEX NUMBER: MS/ITE/25/0037</w:t>
+    </w:r>
+  </w:p>
+</w:hdr>
 </file>
 
 <file path=word/numbering.xml><?xml version="1.0" encoding="utf-8"?>

</xml_diff>